<commit_message>
Align Version 3 guidance and student resources
</commit_message>
<xml_diff>
--- a/files/SAGE_Student_Guide.docx
+++ b/files/SAGE_Student_Guide.docx
@@ -88,7 +88,7 @@
           <w:sz w:val="24"/>
           <w:szCs w:val="24"/>
         </w:rPr>
-        <w:t xml:space="preserve">Five steps that make your work genuinely yours</w:t>
+        <w:t>Six steps that make your learning visible and defensible</w:t>
       </w:r>
     </w:p>
     <w:p>
@@ -174,7 +174,7 @@
           <w:sz w:val="22"/>
           <w:szCs w:val="22"/>
         </w:rPr>
-        <w:t xml:space="preserve">SAGE is a five-step process for using generative AI tools in your coursework and assessments. It is not about whether you can use AI — your lecturer sets that rule. It is about how to use it so that the thinking in your work is genuinely yours.</w:t>
+        <w:t>SAGE is a six-step process for using generative AI tools in your coursework and assessments. It does not determine whether you may use GenAI — your assessment instructions and institutional policy set that rule. It explains how to use GenAI so that the thinking and learning in your work are genuinely yours.</w:t>
       </w:r>
     </w:p>
     <w:p>
@@ -217,6 +217,9 @@
         <w:gridCol w:w="9360"/>
       </w:tblGrid>
       <w:tr>
+        <w:trPr>
+          <w:cantSplit/>
+        </w:trPr>
         <w:tc>
           <w:tcPr>
             <w:tcW w:type="dxa" w:w="9360"/>
@@ -249,7 +252,7 @@
                 <w:sz w:val="20"/>
                 <w:szCs w:val="20"/>
               </w:rPr>
-              <w:t xml:space="preserve">The short version: generate a draft with AI → check it against real sources → fix what is wrong → stress-test your fixes → reflect on what you learned. Each step leaves a record of your thinking. That record is your work.</w:t>
+              <w:t>The short version: generate a draft with AI → check it against real sources → fix what is wrong → ask AI to criticise the developing work and judge that criticism → reflect on what you learned → demonstrate that the learning is yours. Each step leaves a record of your thinking.</w:t>
             </w:r>
           </w:p>
         </w:tc>
@@ -339,6 +342,9 @@
         <w:gridCol w:w="7360"/>
       </w:tblGrid>
       <w:tr>
+        <w:trPr>
+          <w:cantSplit/>
+        </w:trPr>
         <w:tc>
           <w:tcPr>
             <w:tcW w:type="dxa" w:w="2000"/>
@@ -413,6 +419,9 @@
         </w:tc>
       </w:tr>
       <w:tr>
+        <w:trPr>
+          <w:cantSplit/>
+        </w:trPr>
         <w:tc>
           <w:tcPr>
             <w:tcW w:type="dxa" w:w="2000"/>
@@ -487,6 +496,9 @@
         </w:tc>
       </w:tr>
       <w:tr>
+        <w:trPr>
+          <w:cantSplit/>
+        </w:trPr>
         <w:tc>
           <w:tcPr>
             <w:tcW w:type="dxa" w:w="2000"/>
@@ -561,6 +573,9 @@
         </w:tc>
       </w:tr>
       <w:tr>
+        <w:trPr>
+          <w:cantSplit/>
+        </w:trPr>
         <w:tc>
           <w:tcPr>
             <w:tcW w:type="dxa" w:w="2000"/>
@@ -635,6 +650,9 @@
         </w:tc>
       </w:tr>
       <w:tr>
+        <w:trPr>
+          <w:cantSplit/>
+        </w:trPr>
         <w:tc>
           <w:tcPr>
             <w:tcW w:type="dxa" w:w="2000"/>
@@ -709,6 +727,9 @@
         </w:tc>
       </w:tr>
       <w:tr>
+        <w:trPr>
+          <w:cantSplit/>
+        </w:trPr>
         <w:tc>
           <w:tcPr>
             <w:tcW w:type="dxa" w:w="2000"/>
@@ -783,6 +804,9 @@
         </w:tc>
       </w:tr>
       <w:tr>
+        <w:trPr>
+          <w:cantSplit/>
+        </w:trPr>
         <w:tc>
           <w:tcPr>
             <w:tcW w:type="dxa" w:w="2000"/>
@@ -857,6 +881,9 @@
         </w:tc>
       </w:tr>
       <w:tr>
+        <w:trPr>
+          <w:cantSplit/>
+        </w:trPr>
         <w:tc>
           <w:tcPr>
             <w:tcW w:type="dxa" w:w="2000"/>
@@ -952,6 +979,9 @@
         <w:gridCol w:w="9360"/>
       </w:tblGrid>
       <w:tr>
+        <w:trPr>
+          <w:cantSplit/>
+        </w:trPr>
         <w:tc>
           <w:tcPr>
             <w:tcW w:type="dxa" w:w="9360"/>
@@ -1031,6 +1061,9 @@
         <w:gridCol w:w="4000"/>
       </w:tblGrid>
       <w:tr>
+        <w:trPr>
+          <w:cantSplit/>
+        </w:trPr>
         <w:tc>
           <w:tcPr>
             <w:tcW w:type="dxa" w:w="520"/>
@@ -1229,6 +1262,9 @@
         <w:gridCol w:w="9360"/>
       </w:tblGrid>
       <w:tr>
+        <w:trPr>
+          <w:cantSplit/>
+        </w:trPr>
         <w:tc>
           <w:tcPr>
             <w:tcW w:type="dxa" w:w="9360"/>
@@ -1330,6 +1366,9 @@
         <w:gridCol w:w="9360"/>
       </w:tblGrid>
       <w:tr>
+        <w:trPr>
+          <w:cantSplit/>
+        </w:trPr>
         <w:tc>
           <w:tcPr>
             <w:tcW w:type="dxa" w:w="9360"/>
@@ -1408,6 +1447,9 @@
         <w:gridCol w:w="9360"/>
       </w:tblGrid>
       <w:tr>
+        <w:trPr>
+          <w:cantSplit/>
+        </w:trPr>
         <w:tc>
           <w:tcPr>
             <w:tcW w:type="dxa" w:w="9360"/>
@@ -1487,6 +1529,9 @@
         <w:gridCol w:w="4000"/>
       </w:tblGrid>
       <w:tr>
+        <w:trPr>
+          <w:cantSplit/>
+        </w:trPr>
         <w:tc>
           <w:tcPr>
             <w:tcW w:type="dxa" w:w="520"/>
@@ -1686,6 +1731,9 @@
         <w:gridCol w:w="8960"/>
       </w:tblGrid>
       <w:tr>
+        <w:trPr>
+          <w:cantSplit/>
+        </w:trPr>
         <w:tc>
           <w:tcPr>
             <w:tcW w:type="dxa" w:w="400"/>
@@ -1762,6 +1810,9 @@
         </w:tc>
       </w:tr>
       <w:tr>
+        <w:trPr>
+          <w:cantSplit/>
+        </w:trPr>
         <w:tc>
           <w:tcPr>
             <w:tcW w:type="dxa" w:w="400"/>
@@ -1838,6 +1889,9 @@
         </w:tc>
       </w:tr>
       <w:tr>
+        <w:trPr>
+          <w:cantSplit/>
+        </w:trPr>
         <w:tc>
           <w:tcPr>
             <w:tcW w:type="dxa" w:w="400"/>
@@ -1914,6 +1968,9 @@
         </w:tc>
       </w:tr>
       <w:tr>
+        <w:trPr>
+          <w:cantSplit/>
+        </w:trPr>
         <w:tc>
           <w:tcPr>
             <w:tcW w:type="dxa" w:w="400"/>
@@ -2035,6 +2092,9 @@
         <w:gridCol w:w="9360"/>
       </w:tblGrid>
       <w:tr>
+        <w:trPr>
+          <w:cantSplit/>
+        </w:trPr>
         <w:tc>
           <w:tcPr>
             <w:tcW w:type="dxa" w:w="9360"/>
@@ -2114,6 +2174,9 @@
         <w:gridCol w:w="4000"/>
       </w:tblGrid>
       <w:tr>
+        <w:trPr>
+          <w:cantSplit/>
+        </w:trPr>
         <w:tc>
           <w:tcPr>
             <w:tcW w:type="dxa" w:w="520"/>
@@ -2294,6 +2357,9 @@
         <w:gridCol w:w="8240"/>
       </w:tblGrid>
       <w:tr>
+        <w:trPr>
+          <w:cantSplit/>
+        </w:trPr>
         <w:tc>
           <w:tcPr>
             <w:tcW w:type="dxa" w:w="1120"/>
@@ -2392,6 +2458,9 @@
         <w:gridCol w:w="8240"/>
       </w:tblGrid>
       <w:tr>
+        <w:trPr>
+          <w:cantSplit/>
+        </w:trPr>
         <w:tc>
           <w:tcPr>
             <w:tcW w:type="dxa" w:w="1120"/>
@@ -2490,6 +2559,9 @@
         <w:gridCol w:w="8240"/>
       </w:tblGrid>
       <w:tr>
+        <w:trPr>
+          <w:cantSplit/>
+        </w:trPr>
         <w:tc>
           <w:tcPr>
             <w:tcW w:type="dxa" w:w="1120"/>
@@ -2613,6 +2685,9 @@
         <w:gridCol w:w="4800"/>
       </w:tblGrid>
       <w:tr>
+        <w:trPr>
+          <w:cantSplit/>
+        </w:trPr>
         <w:tc>
           <w:tcPr>
             <w:tcW w:type="dxa" w:w="3200"/>
@@ -2723,6 +2798,9 @@
         </w:tc>
       </w:tr>
       <w:tr>
+        <w:trPr>
+          <w:cantSplit/>
+        </w:trPr>
         <w:tc>
           <w:tcPr>
             <w:tcW w:type="dxa" w:w="3200"/>
@@ -2833,6 +2911,9 @@
         </w:tc>
       </w:tr>
       <w:tr>
+        <w:trPr>
+          <w:cantSplit/>
+        </w:trPr>
         <w:tc>
           <w:tcPr>
             <w:tcW w:type="dxa" w:w="3200"/>
@@ -2940,6 +3021,9 @@
         </w:tc>
       </w:tr>
       <w:tr>
+        <w:trPr>
+          <w:cantSplit/>
+        </w:trPr>
         <w:tc>
           <w:tcPr>
             <w:tcW w:type="dxa" w:w="3200"/>
@@ -3047,6 +3131,9 @@
         </w:tc>
       </w:tr>
       <w:tr>
+        <w:trPr>
+          <w:cantSplit/>
+        </w:trPr>
         <w:tc>
           <w:tcPr>
             <w:tcW w:type="dxa" w:w="3200"/>
@@ -3154,6 +3241,9 @@
         </w:tc>
       </w:tr>
       <w:tr>
+        <w:trPr>
+          <w:cantSplit/>
+        </w:trPr>
         <w:tc>
           <w:tcPr>
             <w:tcW w:type="dxa" w:w="3200"/>
@@ -3261,6 +3351,9 @@
         </w:tc>
       </w:tr>
       <w:tr>
+        <w:trPr>
+          <w:cantSplit/>
+        </w:trPr>
         <w:tc>
           <w:tcPr>
             <w:tcW w:type="dxa" w:w="3200"/>
@@ -3389,6 +3482,9 @@
         <w:gridCol w:w="9360"/>
       </w:tblGrid>
       <w:tr>
+        <w:trPr>
+          <w:cantSplit/>
+        </w:trPr>
         <w:tc>
           <w:tcPr>
             <w:tcW w:type="dxa" w:w="9360"/>
@@ -3468,6 +3564,9 @@
         <w:gridCol w:w="4000"/>
       </w:tblGrid>
       <w:tr>
+        <w:trPr>
+          <w:cantSplit/>
+        </w:trPr>
         <w:tc>
           <w:tcPr>
             <w:tcW w:type="dxa" w:w="520"/>
@@ -3558,7 +3657,7 @@
                 <w:sz w:val="26"/>
                 <w:szCs w:val="26"/>
               </w:rPr>
-              <w:t xml:space="preserve">Audit</w:t>
+              <w:t>AI Critic</w:t>
             </w:r>
           </w:p>
         </w:tc>
@@ -3596,7 +3695,7 @@
                 <w:sz w:val="18"/>
                 <w:szCs w:val="18"/>
               </w:rPr>
-              <w:t xml:space="preserve">Use AI to stress-test your reasoning — then judge the AI.</w:t>
+              <w:t>Audit the critic</w:t>
             </w:r>
           </w:p>
         </w:tc>
@@ -3623,7 +3722,7 @@
           <w:sz w:val="22"/>
           <w:szCs w:val="22"/>
         </w:rPr>
-        <w:t xml:space="preserve">You have made your decisions and documented your reasoning. Now use AI to challenge you.</w:t>
+        <w:t>You have made your decisions and documented your reasoning. Now ask GenAI to act as a critic, examiner, reviewer, auditor or devil's advocate.</w:t>
       </w:r>
     </w:p>
     <w:p>
@@ -3642,7 +3741,7 @@
           <w:sz w:val="22"/>
           <w:szCs w:val="22"/>
         </w:rPr>
-        <w:t xml:space="preserve">Write a new prompt that tells the AI to act as a professional expert matched to the anchor you used in Step 2. Give it your decision log and ask it to find weaknesses in your reasoning.</w:t>
+        <w:t>Write a new prompt that tells the AI to act as a professional reviewer matched to the anchor you used in Step 2. Give it your decision log and ask it to find weaknesses in your reasoning. Then evaluate its criticism rather than automatically accepting it.</w:t>
       </w:r>
     </w:p>
     <w:p>
@@ -3666,6 +3765,9 @@
         <w:gridCol w:w="9360"/>
       </w:tblGrid>
       <w:tr>
+        <w:trPr>
+          <w:cantSplit/>
+        </w:trPr>
         <w:tc>
           <w:tcPr>
             <w:tcW w:type="dxa" w:w="9360"/>
@@ -3771,6 +3873,9 @@
         <w:gridCol w:w="4400"/>
       </w:tblGrid>
       <w:tr>
+        <w:trPr>
+          <w:cantSplit/>
+        </w:trPr>
         <w:tc>
           <w:tcPr>
             <w:tcW w:type="dxa" w:w="3600"/>
@@ -3881,6 +3986,9 @@
         </w:tc>
       </w:tr>
       <w:tr>
+        <w:trPr>
+          <w:cantSplit/>
+        </w:trPr>
         <w:tc>
           <w:tcPr>
             <w:tcW w:type="dxa" w:w="3600"/>
@@ -3988,6 +4096,9 @@
         </w:tc>
       </w:tr>
       <w:tr>
+        <w:trPr>
+          <w:cantSplit/>
+        </w:trPr>
         <w:tc>
           <w:tcPr>
             <w:tcW w:type="dxa" w:w="3600"/>
@@ -4095,6 +4206,9 @@
         </w:tc>
       </w:tr>
       <w:tr>
+        <w:trPr>
+          <w:cantSplit/>
+        </w:trPr>
         <w:tc>
           <w:tcPr>
             <w:tcW w:type="dxa" w:w="3600"/>
@@ -4223,6 +4337,9 @@
         <w:gridCol w:w="9360"/>
       </w:tblGrid>
       <w:tr>
+        <w:trPr>
+          <w:cantSplit/>
+        </w:trPr>
         <w:tc>
           <w:tcPr>
             <w:tcW w:type="dxa" w:w="9360"/>
@@ -4255,7 +4372,7 @@
                 <w:sz w:val="20"/>
                 <w:szCs w:val="20"/>
               </w:rPr>
-              <w:t xml:space="preserve">This step is a single bounded pass. You do not keep going back and forth with the AI. One set of flags, one set of adjudications, documented. You are the decision-maker — the AI is the challenger.</w:t>
+              <w:t>The AI Critic activity is a single bounded pass. You do not keep going back and forth with the AI. One set of flags, one set of adjudications, documented. You are the decision-maker — the AI is the challenger.</w:t>
             </w:r>
           </w:p>
         </w:tc>
@@ -4282,6 +4399,9 @@
         <w:gridCol w:w="9360"/>
       </w:tblGrid>
       <w:tr>
+        <w:trPr>
+          <w:cantSplit/>
+        </w:trPr>
         <w:tc>
           <w:tcPr>
             <w:tcW w:type="dxa" w:w="9360"/>
@@ -4361,6 +4481,9 @@
         <w:gridCol w:w="4000"/>
       </w:tblGrid>
       <w:tr>
+        <w:trPr>
+          <w:cantSplit/>
+        </w:trPr>
         <w:tc>
           <w:tcPr>
             <w:tcW w:type="dxa" w:w="520"/>
@@ -4516,7 +4639,7 @@
           <w:sz w:val="22"/>
           <w:szCs w:val="22"/>
         </w:rPr>
-        <w:t xml:space="preserve">Look back over your decision log and your audit adjudications. This is where you turn the experience into learning that will carry forward beyond this task.</w:t>
+        <w:t>Look back over your decision log and your AI Critic adjudications. This is where you turn the experience into learning that will carry forward beyond this task.</w:t>
       </w:r>
     </w:p>
     <w:p>
@@ -4560,6 +4683,9 @@
         <w:gridCol w:w="5760"/>
       </w:tblGrid>
       <w:tr>
+        <w:trPr>
+          <w:cantSplit/>
+        </w:trPr>
         <w:tc>
           <w:tcPr>
             <w:tcW w:type="dxa" w:w="3600"/>
@@ -4634,6 +4760,9 @@
         </w:tc>
       </w:tr>
       <w:tr>
+        <w:trPr>
+          <w:cantSplit/>
+        </w:trPr>
         <w:tc>
           <w:tcPr>
             <w:tcW w:type="dxa" w:w="3600"/>
@@ -4707,6 +4836,9 @@
         </w:tc>
       </w:tr>
       <w:tr>
+        <w:trPr>
+          <w:cantSplit/>
+        </w:trPr>
         <w:tc>
           <w:tcPr>
             <w:tcW w:type="dxa" w:w="3600"/>
@@ -4780,6 +4912,9 @@
         </w:tc>
       </w:tr>
       <w:tr>
+        <w:trPr>
+          <w:cantSplit/>
+        </w:trPr>
         <w:tc>
           <w:tcPr>
             <w:tcW w:type="dxa" w:w="3600"/>
@@ -4853,6 +4988,9 @@
         </w:tc>
       </w:tr>
       <w:tr>
+        <w:trPr>
+          <w:cantSplit/>
+        </w:trPr>
         <w:tc>
           <w:tcPr>
             <w:tcW w:type="dxa" w:w="3600"/>
@@ -4947,6 +5085,9 @@
         <w:gridCol w:w="9360"/>
       </w:tblGrid>
       <w:tr>
+        <w:trPr>
+          <w:cantSplit/>
+        </w:trPr>
         <w:tc>
           <w:tcPr>
             <w:tcW w:type="dxa" w:w="9360"/>
@@ -5006,6 +5147,9 @@
         <w:gridCol w:w="9360"/>
       </w:tblGrid>
       <w:tr>
+        <w:trPr>
+          <w:cantSplit/>
+        </w:trPr>
         <w:tc>
           <w:tcPr>
             <w:tcW w:type="dxa" w:w="9360"/>
@@ -5038,7 +5182,7 @@
                 <w:sz w:val="18"/>
                 <w:szCs w:val="18"/>
               </w:rPr>
-              <w:t xml:space="preserve">💡 If your lecturer includes a supervised session</w:t>
+              <w:t>💡 Steps 1–5 prepare you for Defend</w:t>
             </w:r>
           </w:p>
           <w:p>
@@ -5056,33 +5200,1201 @@
                 <w:sz w:val="20"/>
                 <w:szCs w:val="20"/>
               </w:rPr>
-              <w:t xml:space="preserve">Your decision log and reflection are your preparation. The session is not a test of memory — it is a conversation about your reasoning. If you can walk through your log and explain why you made each decision, you are ready.</w:t>
+              <w:t>Your decision log and reflection are your preparation. Defend is not a test of memory. It asks you to explain, apply and adapt the capability represented in your final work.</w:t>
             </w:r>
           </w:p>
         </w:tc>
       </w:tr>
     </w:tbl>
     <w:p>
-      <w:pPr>
-        <w:spacing w:after="240" w:before="0"/>
-      </w:pPr>
-    </w:p>
-    <w:p>
-      <w:pPr>
-        <w:pBdr>
-          <w:bottom w:val="single" w:color="40916C" w:sz="6"/>
-        </w:pBdr>
-        <w:spacing w:after="60" w:before="60"/>
-      </w:pPr>
-    </w:p>
-    <w:p>
-      <w:pPr>
-        <w:spacing w:after="80" w:before="0"/>
-      </w:pPr>
-    </w:p>
-    <w:p>
-      <w:pPr>
-        <w:spacing w:after="80" w:before="0"/>
+      <w:r>
+        <w:br w:type="page"/>
+      </w:r>
+    </w:p>
+    <w:p>
+      <w:pPr>
+        <w:spacing w:after="440"/>
+      </w:pPr>
+    </w:p>
+    <w:tbl>
+      <w:tblPr>
+        <w:tblW w:type="dxa" w:w="9360"/>
+        <w:tblBorders>
+          <w:top w:val="single" w:color="EEF6F1" w:sz="8"/>
+          <w:left w:val="single" w:color="EEF6F1" w:sz="8"/>
+          <w:bottom w:val="single" w:color="C2DDC0" w:sz="8"/>
+          <w:right w:val="single" w:color="EEF6F1" w:sz="8"/>
+          <w:insideH w:val="single" w:color="auto" w:sz="4"/>
+          <w:insideV w:val="single" w:color="auto" w:sz="4"/>
+        </w:tblBorders>
+      </w:tblPr>
+      <w:tblGrid>
+        <w:gridCol w:w="520"/>
+        <w:gridCol w:w="4840"/>
+        <w:gridCol w:w="4000"/>
+      </w:tblGrid>
+      <w:tr>
+        <w:trPr>
+          <w:cantSplit/>
+        </w:trPr>
+        <w:tc>
+          <w:tcPr>
+            <w:tcW w:type="dxa" w:w="520"/>
+            <w:tcBorders>
+              <w:top w:val="none" w:color="FFFFFF" w:sz="0"/>
+              <w:left w:val="none" w:color="FFFFFF" w:sz="0"/>
+              <w:bottom w:val="none" w:color="FFFFFF" w:sz="0"/>
+              <w:right w:val="none" w:color="FFFFFF" w:sz="0"/>
+            </w:tcBorders>
+            <w:shd w:fill="EEF6F1" w:val="clear"/>
+            <w:tcMar>
+              <w:top w:type="dxa" w:w="120"/>
+              <w:left w:type="dxa" w:w="120"/>
+              <w:bottom w:type="dxa" w:w="120"/>
+              <w:right w:type="dxa" w:w="80"/>
+            </w:tcMar>
+            <w:vAlign w:val="center"/>
+          </w:tcPr>
+          <w:p>
+            <w:pPr>
+              <w:shd w:fill="40916C" w:val="clear"/>
+              <w:spacing w:after="0" w:before="0"/>
+              <w:jc w:val="center"/>
+            </w:pPr>
+            <w:r>
+              <w:rPr>
+                <w:rFonts w:ascii="Arial" w:cs="Arial" w:eastAsia="Arial" w:hAnsi="Arial"/>
+                <w:b/>
+                <w:bCs/>
+                <w:i w:val="false"/>
+                <w:iCs w:val="false"/>
+                <w:color w:val="FFFFFF"/>
+                <w:sz w:val="18"/>
+                <w:szCs w:val="18"/>
+              </w:rPr>
+              <w:t xml:space="preserve">6</w:t>
+            </w:r>
+          </w:p>
+        </w:tc>
+        <w:tc>
+          <w:tcPr>
+            <w:tcW w:type="dxa" w:w="4840"/>
+            <w:tcBorders>
+              <w:top w:val="none" w:color="FFFFFF" w:sz="0"/>
+              <w:left w:val="none" w:color="FFFFFF" w:sz="0"/>
+              <w:bottom w:val="none" w:color="FFFFFF" w:sz="0"/>
+              <w:right w:val="none" w:color="FFFFFF" w:sz="0"/>
+            </w:tcBorders>
+            <w:shd w:fill="EEF6F1" w:val="clear"/>
+            <w:tcMar>
+              <w:top w:type="dxa" w:w="120"/>
+              <w:left w:type="dxa" w:w="80"/>
+              <w:bottom w:type="dxa" w:w="120"/>
+              <w:right w:type="dxa" w:w="80"/>
+            </w:tcMar>
+            <w:vAlign w:val="center"/>
+          </w:tcPr>
+          <w:p>
+            <w:pPr>
+              <w:spacing w:after="40" w:before="0"/>
+            </w:pPr>
+            <w:r>
+              <w:rPr>
+                <w:rFonts w:ascii="Arial" w:cs="Arial" w:eastAsia="Arial" w:hAnsi="Arial"/>
+                <w:b/>
+                <w:bCs/>
+                <w:i w:val="false"/>
+                <w:iCs w:val="false"/>
+                <w:color w:val="6B7A72"/>
+                <w:sz w:val="16"/>
+                <w:szCs w:val="16"/>
+              </w:rPr>
+              <w:t xml:space="preserve">Step 6</w:t>
+            </w:r>
+          </w:p>
+          <w:p>
+            <w:pPr>
+              <w:spacing w:after="0" w:before="0"/>
+            </w:pPr>
+            <w:r>
+              <w:rPr>
+                <w:rFonts w:ascii="Arial" w:cs="Arial" w:eastAsia="Arial" w:hAnsi="Arial"/>
+                <w:b/>
+                <w:bCs/>
+                <w:i w:val="false"/>
+                <w:iCs w:val="false"/>
+                <w:color w:val="1B4332"/>
+                <w:sz w:val="26"/>
+                <w:szCs w:val="26"/>
+              </w:rPr>
+              <w:t xml:space="preserve">Defend</w:t>
+            </w:r>
+          </w:p>
+        </w:tc>
+        <w:tc>
+          <w:tcPr>
+            <w:tcW w:type="dxa" w:w="4000"/>
+            <w:tcBorders>
+              <w:top w:val="none" w:color="FFFFFF" w:sz="0"/>
+              <w:left w:val="none" w:color="FFFFFF" w:sz="0"/>
+              <w:bottom w:val="none" w:color="FFFFFF" w:sz="0"/>
+              <w:right w:val="none" w:color="FFFFFF" w:sz="0"/>
+            </w:tcBorders>
+            <w:shd w:fill="EEF6F1" w:val="clear"/>
+            <w:tcMar>
+              <w:top w:type="dxa" w:w="120"/>
+              <w:left w:type="dxa" w:w="80"/>
+              <w:bottom w:type="dxa" w:w="120"/>
+              <w:right w:type="dxa" w:w="120"/>
+            </w:tcMar>
+            <w:vAlign w:val="center"/>
+          </w:tcPr>
+          <w:p>
+            <w:pPr>
+              <w:spacing w:after="0" w:before="0"/>
+              <w:jc w:val="right"/>
+            </w:pPr>
+            <w:r>
+              <w:rPr>
+                <w:rFonts w:ascii="Arial" w:cs="Arial" w:eastAsia="Arial" w:hAnsi="Arial"/>
+                <w:b w:val="false"/>
+                <w:bCs w:val="false"/>
+                <w:i/>
+                <w:iCs/>
+                <w:color w:val="6B7A72"/>
+                <w:sz w:val="18"/>
+                <w:szCs w:val="18"/>
+              </w:rPr>
+              <w:t xml:space="preserve">Show that the learning is yours.</w:t>
+            </w:r>
+          </w:p>
+        </w:tc>
+      </w:tr>
+    </w:tbl>
+    <w:p>
+      <w:pPr>
+        <w:spacing w:after="140" w:line="240" w:lineRule="auto"/>
+      </w:pPr>
+      <w:r>
+        <w:rPr>
+          <w:rFonts w:ascii="Arial" w:hAnsi="Arial"/>
+          <w:b w:val="0"/>
+          <w:i w:val="0"/>
+          <w:color w:val="374151"/>
+          <w:sz w:val="22"/>
+        </w:rPr>
+        <w:t>In some assessments, your submitted work will be followed by a supervised activity in which you explain, apply, modify or reproduce the capability you developed. SAGE calls this Defend.</w:t>
+      </w:r>
+    </w:p>
+    <w:p>
+      <w:pPr>
+        <w:spacing w:after="140" w:line="240" w:lineRule="auto"/>
+      </w:pPr>
+      <w:r>
+        <w:rPr>
+          <w:rFonts w:ascii="Arial" w:hAnsi="Arial"/>
+          <w:b w:val="0"/>
+          <w:i w:val="0"/>
+          <w:color w:val="374151"/>
+          <w:sz w:val="22"/>
+        </w:rPr>
+        <w:t>Defend is not a test of whether you can memorise your submission word for word. It is an opportunity to demonstrate that you understand the work, can explain the decisions represented in it, and can apply the same capability when the question, context, data or requirements change.</w:t>
+      </w:r>
+    </w:p>
+    <w:p>
+      <w:pPr>
+        <w:spacing w:after="140" w:line="240" w:lineRule="auto"/>
+      </w:pPr>
+      <w:r>
+        <w:rPr>
+          <w:rFonts w:ascii="Arial" w:hAnsi="Arial"/>
+          <w:b w:val="0"/>
+          <w:i w:val="0"/>
+          <w:color w:val="374151"/>
+          <w:sz w:val="22"/>
+        </w:rPr>
+        <w:t>Your educator will tell you whether Defend forms part of your assessment, what format will be used, how long it will take and how it will be marked.</w:t>
+      </w:r>
+    </w:p>
+    <w:p>
+      <w:pPr>
+        <w:keepNext/>
+        <w:spacing w:before="200" w:after="80"/>
+      </w:pPr>
+      <w:r>
+        <w:rPr>
+          <w:rFonts w:ascii="Arial" w:hAnsi="Arial"/>
+          <w:b/>
+          <w:i w:val="0"/>
+          <w:color w:val="1B4332"/>
+          <w:sz w:val="26"/>
+        </w:rPr>
+        <w:t>What might Defend involve?</w:t>
+      </w:r>
+    </w:p>
+    <w:p>
+      <w:pPr>
+        <w:numPr>
+          <w:ilvl w:val="0"/>
+          <w:numId w:val="8"/>
+        </w:numPr>
+        <w:spacing w:after="60"/>
+      </w:pPr>
+      <w:r>
+        <w:rPr>
+          <w:rFonts w:ascii="Arial" w:hAnsi="Arial"/>
+          <w:b w:val="0"/>
+          <w:i w:val="0"/>
+          <w:color w:val="374151"/>
+          <w:sz w:val="21"/>
+        </w:rPr>
+        <w:t>an interactive oral assessment or viva;</w:t>
+      </w:r>
+    </w:p>
+    <w:p>
+      <w:pPr>
+        <w:numPr>
+          <w:ilvl w:val="0"/>
+          <w:numId w:val="8"/>
+        </w:numPr>
+        <w:spacing w:after="60"/>
+      </w:pPr>
+      <w:r>
+        <w:rPr>
+          <w:rFonts w:ascii="Arial" w:hAnsi="Arial"/>
+          <w:b w:val="0"/>
+          <w:i w:val="0"/>
+          <w:color w:val="374151"/>
+          <w:sz w:val="21"/>
+        </w:rPr>
+        <w:t>structured individual questioning after a presentation;</w:t>
+      </w:r>
+    </w:p>
+    <w:p>
+      <w:pPr>
+        <w:numPr>
+          <w:ilvl w:val="0"/>
+          <w:numId w:val="8"/>
+        </w:numPr>
+        <w:spacing w:after="60"/>
+      </w:pPr>
+      <w:r>
+        <w:rPr>
+          <w:rFonts w:ascii="Arial" w:hAnsi="Arial"/>
+          <w:b w:val="0"/>
+          <w:i w:val="0"/>
+          <w:color w:val="374151"/>
+          <w:sz w:val="21"/>
+        </w:rPr>
+        <w:t>a code walkthrough or live debugging task;</w:t>
+      </w:r>
+    </w:p>
+    <w:p>
+      <w:pPr>
+        <w:numPr>
+          <w:ilvl w:val="0"/>
+          <w:numId w:val="8"/>
+        </w:numPr>
+        <w:spacing w:after="60"/>
+      </w:pPr>
+      <w:r>
+        <w:rPr>
+          <w:rFonts w:ascii="Arial" w:hAnsi="Arial"/>
+          <w:b w:val="0"/>
+          <w:i w:val="0"/>
+          <w:color w:val="374151"/>
+          <w:sz w:val="21"/>
+        </w:rPr>
+        <w:t>applying a statistical method to an unseen dataset;</w:t>
+      </w:r>
+    </w:p>
+    <w:p>
+      <w:pPr>
+        <w:numPr>
+          <w:ilvl w:val="0"/>
+          <w:numId w:val="8"/>
+        </w:numPr>
+        <w:spacing w:after="60"/>
+      </w:pPr>
+      <w:r>
+        <w:rPr>
+          <w:rFonts w:ascii="Arial" w:hAnsi="Arial"/>
+          <w:b w:val="0"/>
+          <w:i w:val="0"/>
+          <w:color w:val="374151"/>
+          <w:sz w:val="21"/>
+        </w:rPr>
+        <w:t>explaining a design, calculation, model or technical process;</w:t>
+      </w:r>
+    </w:p>
+    <w:p>
+      <w:pPr>
+        <w:numPr>
+          <w:ilvl w:val="0"/>
+          <w:numId w:val="8"/>
+        </w:numPr>
+        <w:spacing w:after="60"/>
+      </w:pPr>
+      <w:r>
+        <w:rPr>
+          <w:rFonts w:ascii="Arial" w:hAnsi="Arial"/>
+          <w:b w:val="0"/>
+          <w:i w:val="0"/>
+          <w:color w:val="374151"/>
+          <w:sz w:val="21"/>
+        </w:rPr>
+        <w:t>modifying an artefact when a requirement or constraint changes;</w:t>
+      </w:r>
+    </w:p>
+    <w:p>
+      <w:pPr>
+        <w:numPr>
+          <w:ilvl w:val="0"/>
+          <w:numId w:val="8"/>
+        </w:numPr>
+        <w:spacing w:after="60"/>
+      </w:pPr>
+      <w:r>
+        <w:rPr>
+          <w:rFonts w:ascii="Arial" w:hAnsi="Arial"/>
+          <w:b w:val="0"/>
+          <w:i w:val="0"/>
+          <w:color w:val="374151"/>
+          <w:sz w:val="21"/>
+        </w:rPr>
+        <w:t>responding to an unseen professional scenario;</w:t>
+      </w:r>
+    </w:p>
+    <w:p>
+      <w:pPr>
+        <w:numPr>
+          <w:ilvl w:val="0"/>
+          <w:numId w:val="8"/>
+        </w:numPr>
+        <w:spacing w:after="60"/>
+      </w:pPr>
+      <w:r>
+        <w:rPr>
+          <w:rFonts w:ascii="Arial" w:hAnsi="Arial"/>
+          <w:b w:val="0"/>
+          <w:i w:val="0"/>
+          <w:color w:val="374151"/>
+          <w:sz w:val="21"/>
+        </w:rPr>
+        <w:t>completing a short supervised practical task;</w:t>
+      </w:r>
+    </w:p>
+    <w:p>
+      <w:pPr>
+        <w:numPr>
+          <w:ilvl w:val="0"/>
+          <w:numId w:val="8"/>
+        </w:numPr>
+        <w:spacing w:after="60"/>
+      </w:pPr>
+      <w:r>
+        <w:rPr>
+          <w:rFonts w:ascii="Arial" w:hAnsi="Arial"/>
+          <w:b w:val="0"/>
+          <w:i w:val="0"/>
+          <w:color w:val="374151"/>
+          <w:sz w:val="21"/>
+        </w:rPr>
+        <w:t>explaining which contributions came from GenAI and which decisions were yours; and</w:t>
+      </w:r>
+    </w:p>
+    <w:p>
+      <w:pPr>
+        <w:numPr>
+          <w:ilvl w:val="0"/>
+          <w:numId w:val="8"/>
+        </w:numPr>
+        <w:spacing w:after="60"/>
+      </w:pPr>
+      <w:r>
+        <w:rPr>
+          <w:rFonts w:ascii="Arial" w:hAnsi="Arial"/>
+          <w:b w:val="0"/>
+          <w:i w:val="0"/>
+          <w:color w:val="374151"/>
+          <w:sz w:val="21"/>
+        </w:rPr>
+        <w:t>identifying errors, assumptions, limitations or alternative approaches.</w:t>
+      </w:r>
+    </w:p>
+    <w:p>
+      <w:pPr>
+        <w:keepNext/>
+        <w:spacing w:before="200" w:after="80"/>
+      </w:pPr>
+      <w:r>
+        <w:rPr>
+          <w:rFonts w:ascii="Arial" w:hAnsi="Arial"/>
+          <w:b/>
+          <w:i w:val="0"/>
+          <w:color w:val="1B4332"/>
+          <w:sz w:val="26"/>
+        </w:rPr>
+        <w:t>What must you be able to do?</w:t>
+      </w:r>
+    </w:p>
+    <w:p>
+      <w:pPr>
+        <w:numPr>
+          <w:ilvl w:val="0"/>
+          <w:numId w:val="9"/>
+        </w:numPr>
+        <w:spacing w:after="100"/>
+      </w:pPr>
+      <w:r>
+        <w:rPr>
+          <w:rFonts w:ascii="Arial" w:hAnsi="Arial"/>
+          <w:b/>
+          <w:i w:val="0"/>
+          <w:color w:val="1B4332"/>
+          <w:sz w:val="21"/>
+        </w:rPr>
+        <w:t xml:space="preserve">Explain it — </w:t>
+      </w:r>
+      <w:r>
+        <w:rPr>
+          <w:rFonts w:ascii="Arial" w:hAnsi="Arial"/>
+          <w:b w:val="0"/>
+          <w:i w:val="0"/>
+          <w:color w:val="374151"/>
+          <w:sz w:val="21"/>
+        </w:rPr>
+        <w:t>Describe the purpose, reasoning and meaning of every major part in your own words.</w:t>
+      </w:r>
+    </w:p>
+    <w:p>
+      <w:pPr>
+        <w:numPr>
+          <w:ilvl w:val="0"/>
+          <w:numId w:val="9"/>
+        </w:numPr>
+        <w:spacing w:after="100"/>
+      </w:pPr>
+      <w:r>
+        <w:rPr>
+          <w:rFonts w:ascii="Arial" w:hAnsi="Arial"/>
+          <w:b/>
+          <w:i w:val="0"/>
+          <w:color w:val="1B4332"/>
+          <w:sz w:val="21"/>
+        </w:rPr>
+        <w:t xml:space="preserve">Trace it — </w:t>
+      </w:r>
+      <w:r>
+        <w:rPr>
+          <w:rFonts w:ascii="Arial" w:hAnsi="Arial"/>
+          <w:b w:val="0"/>
+          <w:i w:val="0"/>
+          <w:color w:val="374151"/>
+          <w:sz w:val="21"/>
+        </w:rPr>
+        <w:t>Identify what GenAI contributed, what you contributed and where your judgement changed the work.</w:t>
+      </w:r>
+    </w:p>
+    <w:p>
+      <w:pPr>
+        <w:numPr>
+          <w:ilvl w:val="0"/>
+          <w:numId w:val="9"/>
+        </w:numPr>
+        <w:spacing w:after="100"/>
+      </w:pPr>
+      <w:r>
+        <w:rPr>
+          <w:rFonts w:ascii="Arial" w:hAnsi="Arial"/>
+          <w:b/>
+          <w:i w:val="0"/>
+          <w:color w:val="1B4332"/>
+          <w:sz w:val="21"/>
+        </w:rPr>
+        <w:t xml:space="preserve">Justify it — </w:t>
+      </w:r>
+      <w:r>
+        <w:rPr>
+          <w:rFonts w:ascii="Arial" w:hAnsi="Arial"/>
+          <w:b w:val="0"/>
+          <w:i w:val="0"/>
+          <w:color w:val="374151"/>
+          <w:sz w:val="21"/>
+        </w:rPr>
+        <w:t>Explain why you accepted, modified or rejected important AI suggestions using evidence, standards, sources or disciplinary reasoning.</w:t>
+      </w:r>
+    </w:p>
+    <w:p>
+      <w:pPr>
+        <w:numPr>
+          <w:ilvl w:val="0"/>
+          <w:numId w:val="9"/>
+        </w:numPr>
+        <w:spacing w:after="100"/>
+      </w:pPr>
+      <w:r>
+        <w:rPr>
+          <w:rFonts w:ascii="Arial" w:hAnsi="Arial"/>
+          <w:b/>
+          <w:i w:val="0"/>
+          <w:color w:val="1B4332"/>
+          <w:sz w:val="21"/>
+        </w:rPr>
+        <w:t xml:space="preserve">Test it — </w:t>
+      </w:r>
+      <w:r>
+        <w:rPr>
+          <w:rFonts w:ascii="Arial" w:hAnsi="Arial"/>
+          <w:b w:val="0"/>
+          <w:i w:val="0"/>
+          <w:color w:val="374151"/>
+          <w:sz w:val="21"/>
+        </w:rPr>
+        <w:t>Check claims, calculations, references, code, data, assumptions, edge cases and limitations.</w:t>
+      </w:r>
+    </w:p>
+    <w:p>
+      <w:pPr>
+        <w:numPr>
+          <w:ilvl w:val="0"/>
+          <w:numId w:val="9"/>
+        </w:numPr>
+        <w:spacing w:after="100"/>
+      </w:pPr>
+      <w:r>
+        <w:rPr>
+          <w:rFonts w:ascii="Arial" w:hAnsi="Arial"/>
+          <w:b/>
+          <w:i w:val="0"/>
+          <w:color w:val="1B4332"/>
+          <w:sz w:val="21"/>
+        </w:rPr>
+        <w:t xml:space="preserve">Adapt it — </w:t>
+      </w:r>
+      <w:r>
+        <w:rPr>
+          <w:rFonts w:ascii="Arial" w:hAnsi="Arial"/>
+          <w:b w:val="0"/>
+          <w:i w:val="0"/>
+          <w:color w:val="374151"/>
+          <w:sz w:val="21"/>
+        </w:rPr>
+        <w:t>Change the work when the requirements, audience, scenario, data or constraints change.</w:t>
+      </w:r>
+    </w:p>
+    <w:p>
+      <w:pPr>
+        <w:numPr>
+          <w:ilvl w:val="0"/>
+          <w:numId w:val="9"/>
+        </w:numPr>
+        <w:spacing w:after="100"/>
+      </w:pPr>
+      <w:r>
+        <w:rPr>
+          <w:rFonts w:ascii="Arial" w:hAnsi="Arial"/>
+          <w:b/>
+          <w:i w:val="0"/>
+          <w:color w:val="1B4332"/>
+          <w:sz w:val="21"/>
+        </w:rPr>
+        <w:t xml:space="preserve">Reproduce the capability — </w:t>
+      </w:r>
+      <w:r>
+        <w:rPr>
+          <w:rFonts w:ascii="Arial" w:hAnsi="Arial"/>
+          <w:b w:val="0"/>
+          <w:i w:val="0"/>
+          <w:color w:val="374151"/>
+          <w:sz w:val="21"/>
+        </w:rPr>
+        <w:t>Complete a similar task, or part of it, without asking GenAI to reproduce the original answer.</w:t>
+      </w:r>
+    </w:p>
+    <w:p>
+      <w:pPr>
+        <w:numPr>
+          <w:ilvl w:val="0"/>
+          <w:numId w:val="9"/>
+        </w:numPr>
+        <w:spacing w:after="100"/>
+      </w:pPr>
+      <w:r>
+        <w:rPr>
+          <w:rFonts w:ascii="Arial" w:hAnsi="Arial"/>
+          <w:b/>
+          <w:i w:val="0"/>
+          <w:color w:val="1B4332"/>
+          <w:sz w:val="21"/>
+        </w:rPr>
+        <w:t xml:space="preserve">Be honest about limits — </w:t>
+      </w:r>
+      <w:r>
+        <w:rPr>
+          <w:rFonts w:ascii="Arial" w:hAnsi="Arial"/>
+          <w:b w:val="0"/>
+          <w:i w:val="0"/>
+          <w:color w:val="374151"/>
+          <w:sz w:val="21"/>
+        </w:rPr>
+        <w:t>If you do not know an answer, explain what you would check or how you would approach the problem rather than guessing or bluffing.</w:t>
+      </w:r>
+    </w:p>
+    <w:tbl>
+      <w:tblPr>
+        <w:tblW w:type="dxa" w:w="9360"/>
+        <w:tblBorders>
+          <w:top w:val="single" w:color="auto" w:sz="4"/>
+          <w:left w:val="single" w:color="auto" w:sz="4"/>
+          <w:bottom w:val="single" w:color="auto" w:sz="4"/>
+          <w:right w:val="single" w:color="auto" w:sz="4"/>
+          <w:insideH w:val="single" w:color="auto" w:sz="4"/>
+          <w:insideV w:val="single" w:color="auto" w:sz="4"/>
+        </w:tblBorders>
+      </w:tblPr>
+      <w:tblGrid>
+        <w:gridCol w:w="9360"/>
+      </w:tblGrid>
+      <w:tr>
+        <w:trPr>
+          <w:cantSplit/>
+        </w:trPr>
+        <w:tc>
+          <w:tcPr>
+            <w:tcW w:type="dxa" w:w="9360"/>
+            <w:tcBorders>
+              <w:top w:val="single" w:color="DDE5E0" w:sz="4"/>
+              <w:left w:val="single" w:color="1E40AF" w:sz="16"/>
+              <w:bottom w:val="single" w:color="DDE5E0" w:sz="4"/>
+              <w:right w:val="single" w:color="DDE5E0" w:sz="4"/>
+            </w:tcBorders>
+            <w:shd w:fill="EFF6FF" w:val="clear"/>
+            <w:tcMar>
+              <w:top w:type="dxa" w:w="100"/>
+              <w:left w:type="dxa" w:w="160"/>
+              <w:bottom w:type="dxa" w:w="100"/>
+              <w:right w:type="dxa" w:w="120"/>
+            </w:tcMar>
+          </w:tcPr>
+          <w:p>
+            <w:pPr>
+              <w:spacing w:after="60" w:before="0"/>
+            </w:pPr>
+            <w:r>
+              <w:rPr>
+                <w:rFonts w:ascii="Arial" w:cs="Arial" w:eastAsia="Arial" w:hAnsi="Arial"/>
+                <w:b/>
+                <w:bCs/>
+                <w:i w:val="false"/>
+                <w:iCs w:val="false"/>
+                <w:color w:val="1E40AF"/>
+                <w:sz w:val="18"/>
+                <w:szCs w:val="18"/>
+              </w:rPr>
+              <w:t>CQUniversity example</w:t>
+            </w:r>
+          </w:p>
+          <w:p>
+            <w:pPr>
+              <w:spacing w:after="0" w:before="0"/>
+            </w:pPr>
+            <w:r>
+              <w:rPr>
+                <w:rFonts w:ascii="Arial" w:cs="Arial" w:eastAsia="Arial" w:hAnsi="Arial"/>
+                <w:b w:val="false"/>
+                <w:bCs w:val="false"/>
+                <w:i w:val="false"/>
+                <w:iCs w:val="false"/>
+                <w:color w:val="374151"/>
+                <w:sz w:val="20"/>
+                <w:szCs w:val="20"/>
+              </w:rPr>
+            </w:r>
+          </w:p>
+          <w:p>
+            <w:pPr>
+              <w:spacing w:after="0"/>
+            </w:pPr>
+            <w:r>
+              <w:rPr>
+                <w:rFonts w:ascii="Arial" w:hAnsi="Arial"/>
+                <w:color w:val="374151"/>
+                <w:sz w:val="20"/>
+              </w:rPr>
+              <w:t>At CQUniversity, a Tier 2 medium-security guided-assured assessment combines a lower-weighted GenAI-supported preparatory component with a higher-weighted mandatory interactive component. Every student must explain, justify, critique and extend the work in real time. See sage-framework.com/cqu-guided-assured.html#tier2.</w:t>
+            </w:r>
+          </w:p>
+        </w:tc>
+      </w:tr>
+    </w:tbl>
+    <w:p>
+      <w:pPr>
+        <w:keepNext/>
+        <w:spacing w:before="200" w:after="80"/>
+      </w:pPr>
+      <w:r>
+        <w:rPr>
+          <w:rFonts w:ascii="Arial" w:hAnsi="Arial"/>
+          <w:b/>
+          <w:i w:val="0"/>
+          <w:color w:val="1B4332"/>
+          <w:sz w:val="26"/>
+        </w:rPr>
+        <w:t>Preserve an authentic GenAI record</w:t>
+      </w:r>
+    </w:p>
+    <w:p>
+      <w:pPr>
+        <w:spacing w:after="140" w:line="240" w:lineRule="auto"/>
+      </w:pPr>
+      <w:r>
+        <w:rPr>
+          <w:rFonts w:ascii="Arial" w:hAnsi="Arial"/>
+          <w:b w:val="0"/>
+          <w:i w:val="0"/>
+          <w:color w:val="374151"/>
+          <w:sz w:val="22"/>
+        </w:rPr>
+        <w:t>Where your assessment requires an AI log, decision log, chat export or declaration:</w:t>
+      </w:r>
+    </w:p>
+    <w:p>
+      <w:pPr>
+        <w:numPr>
+          <w:ilvl w:val="0"/>
+          <w:numId w:val="8"/>
+        </w:numPr>
+        <w:spacing w:after="60"/>
+      </w:pPr>
+      <w:r>
+        <w:rPr>
+          <w:rFonts w:ascii="Arial" w:hAnsi="Arial"/>
+          <w:b w:val="0"/>
+          <w:i w:val="0"/>
+          <w:color w:val="374151"/>
+          <w:sz w:val="21"/>
+        </w:rPr>
+        <w:t>preserve the complete and authentic evidence required by the assessment;</w:t>
+      </w:r>
+    </w:p>
+    <w:p>
+      <w:pPr>
+        <w:numPr>
+          <w:ilvl w:val="0"/>
+          <w:numId w:val="8"/>
+        </w:numPr>
+        <w:spacing w:after="60"/>
+      </w:pPr>
+      <w:r>
+        <w:rPr>
+          <w:rFonts w:ascii="Arial" w:hAnsi="Arial"/>
+          <w:b w:val="0"/>
+          <w:i w:val="0"/>
+          <w:color w:val="374151"/>
+          <w:sz w:val="21"/>
+        </w:rPr>
+        <w:t>do not fabricate, selectively alter or misrepresent AI interactions;</w:t>
+      </w:r>
+    </w:p>
+    <w:p>
+      <w:pPr>
+        <w:numPr>
+          <w:ilvl w:val="0"/>
+          <w:numId w:val="8"/>
+        </w:numPr>
+        <w:spacing w:after="60"/>
+      </w:pPr>
+      <w:r>
+        <w:rPr>
+          <w:rFonts w:ascii="Arial" w:hAnsi="Arial"/>
+          <w:b w:val="0"/>
+          <w:i w:val="0"/>
+          <w:color w:val="374151"/>
+          <w:sz w:val="21"/>
+        </w:rPr>
+        <w:t>retain the required records until the assessment and any review period are complete;</w:t>
+      </w:r>
+    </w:p>
+    <w:p>
+      <w:pPr>
+        <w:numPr>
+          <w:ilvl w:val="0"/>
+          <w:numId w:val="8"/>
+        </w:numPr>
+        <w:spacing w:after="60"/>
+      </w:pPr>
+      <w:r>
+        <w:rPr>
+          <w:rFonts w:ascii="Arial" w:hAnsi="Arial"/>
+          <w:b w:val="0"/>
+          <w:i w:val="0"/>
+          <w:color w:val="374151"/>
+          <w:sz w:val="21"/>
+        </w:rPr>
+        <w:t>record meaningful accept, modify and reject decisions;</w:t>
+      </w:r>
+    </w:p>
+    <w:p>
+      <w:pPr>
+        <w:numPr>
+          <w:ilvl w:val="0"/>
+          <w:numId w:val="8"/>
+        </w:numPr>
+        <w:spacing w:after="60"/>
+      </w:pPr>
+      <w:r>
+        <w:rPr>
+          <w:rFonts w:ascii="Arial" w:hAnsi="Arial"/>
+          <w:b w:val="0"/>
+          <w:i w:val="0"/>
+          <w:color w:val="374151"/>
+          <w:sz w:val="21"/>
+        </w:rPr>
+        <w:t>retain the sources, standards and evidence used to check AI output;</w:t>
+      </w:r>
+    </w:p>
+    <w:p>
+      <w:pPr>
+        <w:numPr>
+          <w:ilvl w:val="0"/>
+          <w:numId w:val="8"/>
+        </w:numPr>
+        <w:spacing w:after="60"/>
+      </w:pPr>
+      <w:r>
+        <w:rPr>
+          <w:rFonts w:ascii="Arial" w:hAnsi="Arial"/>
+          <w:b w:val="0"/>
+          <w:i w:val="0"/>
+          <w:color w:val="374151"/>
+          <w:sz w:val="21"/>
+        </w:rPr>
+        <w:t>protect personal, confidential and restricted information; and</w:t>
+      </w:r>
+    </w:p>
+    <w:p>
+      <w:pPr>
+        <w:numPr>
+          <w:ilvl w:val="0"/>
+          <w:numId w:val="8"/>
+        </w:numPr>
+        <w:spacing w:after="60"/>
+      </w:pPr>
+      <w:r>
+        <w:rPr>
+          <w:rFonts w:ascii="Arial" w:hAnsi="Arial"/>
+          <w:b w:val="0"/>
+          <w:i w:val="0"/>
+          <w:color w:val="374151"/>
+          <w:sz w:val="21"/>
+        </w:rPr>
+        <w:t>follow your educator's storage and submission instructions.</w:t>
+      </w:r>
+    </w:p>
+    <w:p>
+      <w:pPr>
+        <w:spacing w:after="140" w:line="240" w:lineRule="auto"/>
+      </w:pPr>
+      <w:r>
+        <w:rPr>
+          <w:rFonts w:ascii="Arial" w:hAnsi="Arial"/>
+          <w:b w:val="0"/>
+          <w:i w:val="0"/>
+          <w:color w:val="374151"/>
+          <w:sz w:val="22"/>
+        </w:rPr>
+        <w:t>Your log supports transparency and helps you prepare, but the log alone does not prove that you developed the capability. You must also be able to explain, apply and adapt the learning represented in the final work.</w:t>
+      </w:r>
+    </w:p>
+    <w:p>
+      <w:pPr>
+        <w:keepNext/>
+        <w:spacing w:before="200" w:after="80"/>
+      </w:pPr>
+      <w:r>
+        <w:rPr>
+          <w:rFonts w:ascii="Arial" w:hAnsi="Arial"/>
+          <w:b/>
+          <w:i w:val="0"/>
+          <w:color w:val="1B4332"/>
+          <w:sz w:val="26"/>
+        </w:rPr>
+        <w:t>Prepare before submission</w:t>
+      </w:r>
+    </w:p>
+    <w:p>
+      <w:pPr>
+        <w:spacing w:after="80"/>
+        <w:ind w:left="320" w:hanging="320"/>
+      </w:pPr>
+      <w:r>
+        <w:rPr>
+          <w:rFonts w:ascii="Arial" w:hAnsi="Arial"/>
+          <w:b/>
+          <w:i w:val="0"/>
+          <w:color w:val="2D6A4F"/>
+          <w:sz w:val="22"/>
+        </w:rPr>
+        <w:t xml:space="preserve">☐ </w:t>
+      </w:r>
+      <w:r>
+        <w:rPr>
+          <w:rFonts w:ascii="Arial" w:hAnsi="Arial"/>
+          <w:b w:val="0"/>
+          <w:i w:val="0"/>
+          <w:color w:val="374151"/>
+          <w:sz w:val="21"/>
+        </w:rPr>
+        <w:t>Can I explain every major part without reading from the AI output?</w:t>
+      </w:r>
+    </w:p>
+    <w:p>
+      <w:pPr>
+        <w:spacing w:after="80"/>
+        <w:ind w:left="320" w:hanging="320"/>
+      </w:pPr>
+      <w:r>
+        <w:rPr>
+          <w:rFonts w:ascii="Arial" w:hAnsi="Arial"/>
+          <w:b/>
+          <w:i w:val="0"/>
+          <w:color w:val="2D6A4F"/>
+          <w:sz w:val="22"/>
+        </w:rPr>
+        <w:t xml:space="preserve">☐ </w:t>
+      </w:r>
+      <w:r>
+        <w:rPr>
+          <w:rFonts w:ascii="Arial" w:hAnsi="Arial"/>
+          <w:b w:val="0"/>
+          <w:i w:val="0"/>
+          <w:color w:val="374151"/>
+          <w:sz w:val="21"/>
+        </w:rPr>
+        <w:t>Can I identify an important error, limitation or assumption?</w:t>
+      </w:r>
+    </w:p>
+    <w:p>
+      <w:pPr>
+        <w:spacing w:after="80"/>
+        <w:ind w:left="320" w:hanging="320"/>
+      </w:pPr>
+      <w:r>
+        <w:rPr>
+          <w:rFonts w:ascii="Arial" w:hAnsi="Arial"/>
+          <w:b/>
+          <w:i w:val="0"/>
+          <w:color w:val="2D6A4F"/>
+          <w:sz w:val="22"/>
+        </w:rPr>
+        <w:t xml:space="preserve">☐ </w:t>
+      </w:r>
+      <w:r>
+        <w:rPr>
+          <w:rFonts w:ascii="Arial" w:hAnsi="Arial"/>
+          <w:b w:val="0"/>
+          <w:i w:val="0"/>
+          <w:color w:val="374151"/>
+          <w:sz w:val="21"/>
+        </w:rPr>
+        <w:t>Can I justify my choices using an authoritative anchor?</w:t>
+      </w:r>
+    </w:p>
+    <w:p>
+      <w:pPr>
+        <w:spacing w:after="80"/>
+        <w:ind w:left="320" w:hanging="320"/>
+      </w:pPr>
+      <w:r>
+        <w:rPr>
+          <w:rFonts w:ascii="Arial" w:hAnsi="Arial"/>
+          <w:b/>
+          <w:i w:val="0"/>
+          <w:color w:val="2D6A4F"/>
+          <w:sz w:val="22"/>
+        </w:rPr>
+        <w:t xml:space="preserve">☐ </w:t>
+      </w:r>
+      <w:r>
+        <w:rPr>
+          <w:rFonts w:ascii="Arial" w:hAnsi="Arial"/>
+          <w:b w:val="0"/>
+          <w:i w:val="0"/>
+          <w:color w:val="374151"/>
+          <w:sz w:val="21"/>
+        </w:rPr>
+        <w:t>Can I explain the trade-offs behind my decisions?</w:t>
+      </w:r>
+    </w:p>
+    <w:p>
+      <w:pPr>
+        <w:spacing w:after="80"/>
+        <w:ind w:left="320" w:hanging="320"/>
+      </w:pPr>
+      <w:r>
+        <w:rPr>
+          <w:rFonts w:ascii="Arial" w:hAnsi="Arial"/>
+          <w:b/>
+          <w:i w:val="0"/>
+          <w:color w:val="2D6A4F"/>
+          <w:sz w:val="22"/>
+        </w:rPr>
+        <w:t xml:space="preserve">☐ </w:t>
+      </w:r>
+      <w:r>
+        <w:rPr>
+          <w:rFonts w:ascii="Arial" w:hAnsi="Arial"/>
+          <w:b w:val="0"/>
+          <w:i w:val="0"/>
+          <w:color w:val="374151"/>
+          <w:sz w:val="21"/>
+        </w:rPr>
+        <w:t>Can I modify the work for a changed requirement?</w:t>
+      </w:r>
+    </w:p>
+    <w:p>
+      <w:pPr>
+        <w:spacing w:after="80"/>
+        <w:ind w:left="320" w:hanging="320"/>
+      </w:pPr>
+      <w:r>
+        <w:rPr>
+          <w:rFonts w:ascii="Arial" w:hAnsi="Arial"/>
+          <w:b/>
+          <w:i w:val="0"/>
+          <w:color w:val="2D6A4F"/>
+          <w:sz w:val="22"/>
+        </w:rPr>
+        <w:t xml:space="preserve">☐ </w:t>
+      </w:r>
+      <w:r>
+        <w:rPr>
+          <w:rFonts w:ascii="Arial" w:hAnsi="Arial"/>
+          <w:b w:val="0"/>
+          <w:i w:val="0"/>
+          <w:color w:val="374151"/>
+          <w:sz w:val="21"/>
+        </w:rPr>
+        <w:t>Can I complete a similar task without reproducing the same AI conversation?</w:t>
+      </w:r>
+    </w:p>
+    <w:p>
+      <w:pPr>
+        <w:spacing w:after="80"/>
+        <w:ind w:left="320" w:hanging="320"/>
+      </w:pPr>
+      <w:r>
+        <w:rPr>
+          <w:rFonts w:ascii="Arial" w:hAnsi="Arial"/>
+          <w:b/>
+          <w:i w:val="0"/>
+          <w:color w:val="2D6A4F"/>
+          <w:sz w:val="22"/>
+        </w:rPr>
+        <w:t xml:space="preserve">☐ </w:t>
+      </w:r>
+      <w:r>
+        <w:rPr>
+          <w:rFonts w:ascii="Arial" w:hAnsi="Arial"/>
+          <w:b w:val="0"/>
+          <w:i w:val="0"/>
+          <w:color w:val="374151"/>
+          <w:sz w:val="21"/>
+        </w:rPr>
+        <w:t>Can I distinguish my contribution from the AI contribution?</w:t>
+      </w:r>
+    </w:p>
+    <w:tbl>
+      <w:tblPr>
+        <w:tblW w:type="dxa" w:w="9360"/>
+        <w:tblBorders>
+          <w:top w:val="single" w:color="auto" w:sz="4"/>
+          <w:left w:val="single" w:color="auto" w:sz="4"/>
+          <w:bottom w:val="single" w:color="auto" w:sz="4"/>
+          <w:right w:val="single" w:color="auto" w:sz="4"/>
+          <w:insideH w:val="single" w:color="auto" w:sz="4"/>
+          <w:insideV w:val="single" w:color="auto" w:sz="4"/>
+        </w:tblBorders>
+      </w:tblPr>
+      <w:tblGrid>
+        <w:gridCol w:w="9360"/>
+      </w:tblGrid>
+      <w:tr>
+        <w:trPr>
+          <w:cantSplit/>
+        </w:trPr>
+        <w:tc>
+          <w:tcPr>
+            <w:tcW w:type="dxa" w:w="9360"/>
+            <w:tcBorders>
+              <w:top w:val="single" w:color="DDE5E0" w:sz="4"/>
+              <w:left w:val="single" w:color="1E40AF" w:sz="16"/>
+              <w:bottom w:val="single" w:color="DDE5E0" w:sz="4"/>
+              <w:right w:val="single" w:color="DDE5E0" w:sz="4"/>
+            </w:tcBorders>
+            <w:shd w:fill="EFF6FF" w:val="clear"/>
+            <w:tcMar>
+              <w:top w:type="dxa" w:w="100"/>
+              <w:left w:type="dxa" w:w="160"/>
+              <w:bottom w:type="dxa" w:w="100"/>
+              <w:right w:type="dxa" w:w="120"/>
+            </w:tcMar>
+          </w:tcPr>
+          <w:p>
+            <w:pPr>
+              <w:spacing w:after="60" w:before="0"/>
+            </w:pPr>
+            <w:r>
+              <w:rPr>
+                <w:rFonts w:ascii="Arial" w:cs="Arial" w:eastAsia="Arial" w:hAnsi="Arial"/>
+                <w:b/>
+                <w:bCs/>
+                <w:i w:val="false"/>
+                <w:iCs w:val="false"/>
+                <w:color w:val="1E40AF"/>
+                <w:sz w:val="18"/>
+                <w:szCs w:val="18"/>
+              </w:rPr>
+              <w:t>Practise before you Defend</w:t>
+            </w:r>
+          </w:p>
+          <w:p>
+            <w:pPr>
+              <w:spacing w:after="0" w:before="0"/>
+            </w:pPr>
+            <w:r>
+              <w:rPr>
+                <w:rFonts w:ascii="Arial" w:cs="Arial" w:eastAsia="Arial" w:hAnsi="Arial"/>
+                <w:b w:val="false"/>
+                <w:bCs w:val="false"/>
+                <w:i w:val="false"/>
+                <w:iCs w:val="false"/>
+                <w:color w:val="374151"/>
+                <w:sz w:val="20"/>
+                <w:szCs w:val="20"/>
+              </w:rPr>
+            </w:r>
+          </w:p>
+          <w:p>
+            <w:pPr>
+              <w:spacing w:after="0"/>
+            </w:pPr>
+            <w:r>
+              <w:rPr>
+                <w:rFonts w:ascii="Arial" w:hAnsi="Arial"/>
+                <w:color w:val="374151"/>
+                <w:sz w:val="20"/>
+              </w:rPr>
+              <w:t>Complete GenAI-101, particularly Lesson 7, “Use AI as a Critical Coach”, and the Transfer Test activities in the later lessons. These activities help you practise explaining, checking, changing and reproducing AI-assisted work under different conditions. See sage-framework.com/genai-101.html.</w:t>
+            </w:r>
+          </w:p>
+        </w:tc>
+      </w:tr>
+    </w:tbl>
+    <w:p>
+      <w:pPr>
+        <w:spacing w:after="80" w:before="200"/>
       </w:pPr>
       <w:r>
         <w:rPr>
@@ -5389,11 +6701,165 @@
       </w:pPr>
     </w:lvl>
   </w:abstractNum>
+  <w:abstractNum w:abstractNumId="4">
+    <w:nsid w:val="00000005"/>
+    <w:multiLevelType w:val="singleLevel"/>
+    <w:lvl w:ilvl="0">
+      <w:start w:val="1"/>
+      <w:numFmt w:val="bullet"/>
+      <w:lvlText w:val="•"/>
+      <w:suff w:val="tab"/>
+      <w:lvlJc w:val="left"/>
+      <w:pPr>
+        <w:tabs>
+          <w:tab w:val="num" w:pos="360"/>
+        </w:tabs>
+        <w:ind w:left="360" w:hanging="180"/>
+      </w:pPr>
+    </w:lvl>
+  </w:abstractNum>
+  <w:abstractNum w:abstractNumId="5">
+    <w:nsid w:val="00000006"/>
+    <w:multiLevelType w:val="singleLevel"/>
+    <w:lvl w:ilvl="0">
+      <w:start w:val="1"/>
+      <w:numFmt w:val="decimal"/>
+      <w:lvlText w:val="%1."/>
+      <w:suff w:val="tab"/>
+      <w:lvlJc w:val="left"/>
+      <w:pPr>
+        <w:tabs>
+          <w:tab w:val="num" w:pos="360"/>
+        </w:tabs>
+        <w:ind w:left="360" w:hanging="180"/>
+      </w:pPr>
+    </w:lvl>
+  </w:abstractNum>
+  <w:abstractNum w:abstractNumId="6">
+    <w:nsid w:val="00000007"/>
+    <w:multiLevelType w:val="singleLevel"/>
+    <w:lvl w:ilvl="0">
+      <w:start w:val="1"/>
+      <w:numFmt w:val="bullet"/>
+      <w:lvlText w:val="•"/>
+      <w:suff w:val="tab"/>
+      <w:lvlJc w:val="left"/>
+      <w:pPr>
+        <w:tabs>
+          <w:tab w:val="num" w:pos="360"/>
+        </w:tabs>
+        <w:ind w:left="360" w:hanging="180"/>
+      </w:pPr>
+    </w:lvl>
+  </w:abstractNum>
+  <w:abstractNum w:abstractNumId="7">
+    <w:nsid w:val="00000008"/>
+    <w:multiLevelType w:val="singleLevel"/>
+    <w:lvl w:ilvl="0">
+      <w:start w:val="1"/>
+      <w:numFmt w:val="decimal"/>
+      <w:lvlText w:val="%1."/>
+      <w:suff w:val="tab"/>
+      <w:lvlJc w:val="left"/>
+      <w:pPr>
+        <w:tabs>
+          <w:tab w:val="num" w:pos="360"/>
+        </w:tabs>
+        <w:ind w:left="360" w:hanging="180"/>
+      </w:pPr>
+    </w:lvl>
+  </w:abstractNum>
+  <w:abstractNum w:abstractNumId="8">
+    <w:nsid w:val="00000009"/>
+    <w:multiLevelType w:val="singleLevel"/>
+    <w:lvl w:ilvl="0">
+      <w:start w:val="1"/>
+      <w:numFmt w:val="bullet"/>
+      <w:lvlText w:val="•"/>
+      <w:suff w:val="tab"/>
+      <w:lvlJc w:val="left"/>
+      <w:pPr>
+        <w:tabs>
+          <w:tab w:val="num" w:pos="360"/>
+        </w:tabs>
+        <w:ind w:left="360" w:hanging="180"/>
+      </w:pPr>
+    </w:lvl>
+  </w:abstractNum>
+  <w:abstractNum w:abstractNumId="9">
+    <w:nsid w:val="0000000A"/>
+    <w:multiLevelType w:val="singleLevel"/>
+    <w:lvl w:ilvl="0">
+      <w:start w:val="1"/>
+      <w:numFmt w:val="decimal"/>
+      <w:lvlText w:val="%1."/>
+      <w:suff w:val="tab"/>
+      <w:lvlJc w:val="left"/>
+      <w:pPr>
+        <w:tabs>
+          <w:tab w:val="num" w:pos="360"/>
+        </w:tabs>
+        <w:ind w:left="360" w:hanging="180"/>
+      </w:pPr>
+    </w:lvl>
+  </w:abstractNum>
   <w:num w:numId="1">
     <w:abstractNumId w:val="1"/>
     <w:lvlOverride w:ilvl="0">
       <w:startOverride w:val="1"/>
     </w:lvlOverride>
+  </w:num>
+  <w:abstractNum w:abstractNumId="2">
+    <w:multiLevelType w:val="singleLevel"/>
+    <w:lvl w:ilvl="0">
+      <w:start w:val="1"/>
+      <w:numFmt w:val="bullet"/>
+      <w:lvlText w:val="•"/>
+      <w:pPr>
+        <w:tabs>
+          <w:tab w:val="num" w:pos="360"/>
+        </w:tabs>
+        <w:ind w:left="360" w:hanging="180"/>
+      </w:pPr>
+    </w:lvl>
+  </w:abstractNum>
+  <w:num w:numId="2">
+    <w:abstractNumId w:val="2"/>
+  </w:num>
+  <w:abstractNum w:abstractNumId="3">
+    <w:multiLevelType w:val="singleLevel"/>
+    <w:lvl w:ilvl="0">
+      <w:start w:val="1"/>
+      <w:numFmt w:val="decimal"/>
+      <w:lvlText w:val="%1."/>
+      <w:pPr>
+        <w:tabs>
+          <w:tab w:val="num" w:pos="360"/>
+        </w:tabs>
+        <w:ind w:left="360" w:hanging="180"/>
+      </w:pPr>
+    </w:lvl>
+  </w:abstractNum>
+  <w:num w:numId="3">
+    <w:abstractNumId w:val="3"/>
+  </w:num>
+  <w:num w:numId="4">
+    <w:abstractNumId w:val="4"/>
+  </w:num>
+  <w:num w:numId="5">
+    <w:abstractNumId w:val="5"/>
+  </w:num>
+  <w:num w:numId="6">
+    <w:abstractNumId w:val="6"/>
+  </w:num>
+  <w:num w:numId="7">
+    <w:abstractNumId w:val="7"/>
+  </w:num>
+  <w:num w:numId="8">
+    <w:abstractNumId w:val="8"/>
+  </w:num>
+  <w:num w:numId="9">
+    <w:abstractNumId w:val="9"/>
   </w:num>
 </w:numbering>
 </file>

</xml_diff>